<commit_message>
added descriptive tables, update to H1
</commit_message>
<xml_diff>
--- a/preregistration/MeLiDos_ZaunerEtAl_analysis_plan.docx
+++ b/preregistration/MeLiDos_ZaunerEtAl_analysis_plan.docx
@@ -2407,12 +2407,14 @@
               <w:rPr>
                 <w:sz w:val="16"/>
                 <w:szCs w:val="16"/>
+                <w:highlight w:val="yellow"/>
               </w:rPr>
             </w:pPr>
             <w:r>
               <w:rPr>
                 <w:sz w:val="16"/>
                 <w:szCs w:val="16"/>
+                <w:highlight w:val="yellow"/>
               </w:rPr>
               <w:t>Country</w:t>
             </w:r>
@@ -2559,12 +2561,14 @@
               <w:rPr>
                 <w:sz w:val="16"/>
                 <w:szCs w:val="16"/>
+                <w:highlight w:val="yellow"/>
               </w:rPr>
             </w:pPr>
             <w:r>
               <w:rPr>
                 <w:sz w:val="16"/>
                 <w:szCs w:val="16"/>
+                <w:highlight w:val="yellow"/>
               </w:rPr>
               <w:t>N participant</w:t>
             </w:r>
@@ -2711,12 +2715,14 @@
               <w:rPr>
                 <w:sz w:val="16"/>
                 <w:szCs w:val="16"/>
+                <w:highlight w:val="yellow"/>
               </w:rPr>
             </w:pPr>
             <w:r>
               <w:rPr>
                 <w:sz w:val="16"/>
                 <w:szCs w:val="16"/>
+                <w:highlight w:val="yellow"/>
               </w:rPr>
               <w:t>N days</w:t>
             </w:r>
@@ -2869,6 +2875,7 @@
               <w:rPr>
                 <w:sz w:val="16"/>
                 <w:szCs w:val="16"/>
+                <w:highlight w:val="yellow"/>
               </w:rPr>
               <w:t>N weekend/weekdays</w:t>
             </w:r>
@@ -3021,6 +3028,7 @@
               <w:rPr>
                 <w:sz w:val="16"/>
                 <w:szCs w:val="16"/>
+                <w:highlight w:val="yellow"/>
               </w:rPr>
               <w:t>Geolocation coordinates</w:t>
             </w:r>

</xml_diff>